<commit_message>
Resume dates on every layout read "Jan 2021 to Present"
The builder turns 01/2021 into Jan 2021, the QA date check applies to every
layout, and the sample and example resumes use month names.

Co-Authored-By: Claude Opus 5.5 <noreply@anthropic.com>
Claude-Session: https://claude.ai/code/session_015bzELwEoawCrWnjLqSjadS
</commit_message>
<xml_diff>
--- a/examples/jordan-rivera/companies/harborline-software/Jordan_Rivera_Resume_Harborline.docx
+++ b/examples/jordan-rivera/companies/harborline-software/Jordan_Rivera_Resume_Harborline.docx
@@ -88,7 +88,7 @@
         </w:rPr>
         <w:t xml:space="preserve">  |  </w:t>
       </w:r>
-      <w:hyperlink w:history="1" r:id="rId8ehrczmfuw99nalh7hubq">
+      <w:hyperlink w:history="1" r:id="rIdms3bw22grpfiyxazwg5qm">
         <w:r>
           <w:rPr>
             <w:rFonts w:ascii="Arial" w:cs="Arial" w:eastAsia="Arial" w:hAnsi="Arial"/>
@@ -109,7 +109,7 @@
         </w:rPr>
         <w:t xml:space="preserve">  |  </w:t>
       </w:r>
-      <w:hyperlink w:history="1" r:id="rIdfka6zgcj2jelcjdig0nia">
+      <w:hyperlink w:history="1" r:id="rIdnrev0n59ho-gu3-hesct0">
         <w:r>
           <w:rPr>
             <w:rFonts w:ascii="Arial" w:cs="Arial" w:eastAsia="Arial" w:hAnsi="Arial"/>
@@ -735,7 +735,7 @@
           <w:sz w:val="19"/>
           <w:szCs w:val="19"/>
         </w:rPr>
-        <w:t xml:space="preserve">	01/2021 to Present</w:t>
+        <w:t xml:space="preserve">	Jan 2021 to Present</w:t>
       </w:r>
     </w:p>
     <w:p>
@@ -998,7 +998,7 @@
           <w:sz w:val="19"/>
           <w:szCs w:val="19"/>
         </w:rPr>
-        <w:t xml:space="preserve">	03/2019 to 12/2020</w:t>
+        <w:t xml:space="preserve">	Mar 2019 to Dec 2020</w:t>
       </w:r>
     </w:p>
     <w:p>
@@ -1067,7 +1067,7 @@
           <w:sz w:val="19"/>
           <w:szCs w:val="19"/>
         </w:rPr>
-        <w:t xml:space="preserve">	06/2015 to 02/2019</w:t>
+        <w:t xml:space="preserve">	Jun 2015 to Feb 2019</w:t>
       </w:r>
     </w:p>
     <w:p>
@@ -1217,7 +1217,7 @@
           <w:sz w:val="19"/>
           <w:szCs w:val="19"/>
         </w:rPr>
-        <w:t xml:space="preserve">	09/2013 to 05/2015</w:t>
+        <w:t xml:space="preserve">	Sep 2013 to May 2015</w:t>
       </w:r>
     </w:p>
     <w:p>
@@ -1346,7 +1346,7 @@
           <w:sz w:val="19"/>
           <w:szCs w:val="19"/>
         </w:rPr>
-        <w:t xml:space="preserve">	07/2012 to 08/2013</w:t>
+        <w:t xml:space="preserve">	Jul 2012 to Aug 2013</w:t>
       </w:r>
     </w:p>
     <w:p>

</xml_diff>

<commit_message>
QA: no bullet or card body ends on a line of 1 or 2 words
- Resume QA reads line positions from the PDF and fails any wrapped
  bullet whose last line holds 1 or 2 words, naming the bullet and the
  short line.
- The card check does the same for the intro and every card body, from
  the printed PDF, so it works with Playwright and WeasyPrint.
- resume-builder and baseball-card roles: shorten that text (cut filler,
  never a number or fact) until it takes one line less, rebuild, rerun.
- Fixed the short endings the checks found in the sample and example
  resumes and cards; rebuilt the example PDFs.
- Tests for both checks.

Co-Authored-By: Claude Opus 5.5 <noreply@anthropic.com>
Claude-Session: https://claude.ai/code/session_015bzELwEoawCrWnjLqSjadS
</commit_message>
<xml_diff>
--- a/examples/jordan-rivera/companies/harborline-software/Jordan_Rivera_Resume_Harborline.docx
+++ b/examples/jordan-rivera/companies/harborline-software/Jordan_Rivera_Resume_Harborline.docx
@@ -88,7 +88,7 @@
         </w:rPr>
         <w:t xml:space="preserve">  |  </w:t>
       </w:r>
-      <w:hyperlink w:history="1" r:id="rIdms3bw22grpfiyxazwg5qm">
+      <w:hyperlink w:history="1" r:id="rIdt7i9cwytb78kw5dy48jjg">
         <w:r>
           <w:rPr>
             <w:rFonts w:ascii="Arial" w:cs="Arial" w:eastAsia="Arial" w:hAnsi="Arial"/>
@@ -109,7 +109,7 @@
         </w:rPr>
         <w:t xml:space="preserve">  |  </w:t>
       </w:r>
-      <w:hyperlink w:history="1" r:id="rIdnrev0n59ho-gu3-hesct0">
+      <w:hyperlink w:history="1" r:id="rId2r4nnbfmzfxoiunshpj3j">
         <w:r>
           <w:rPr>
             <w:rFonts w:ascii="Arial" w:cs="Arial" w:eastAsia="Arial" w:hAnsi="Arial"/>
@@ -461,16 +461,16 @@
           <w:sz w:val="20"/>
           <w:szCs w:val="20"/>
         </w:rPr>
-        <w:t xml:space="preserve">On time, every day. </w:t>
-      </w:r>
-      <w:r>
-        <w:rPr>
-          <w:rFonts w:ascii="Arial" w:cs="Arial" w:eastAsia="Arial" w:hAnsi="Arial"/>
-          <w:color w:val="1A1A1A"/>
-          <w:sz w:val="20"/>
-          <w:szCs w:val="20"/>
-        </w:rPr>
-        <w:t xml:space="preserve">Raised on-time shipment rate from 91% to 98.5% across two distribution centers at Brightpine Distribution.</w:t>
+        <w:t xml:space="preserve">On-time shipping. </w:t>
+      </w:r>
+      <w:r>
+        <w:rPr>
+          <w:rFonts w:ascii="Arial" w:cs="Arial" w:eastAsia="Arial" w:hAnsi="Arial"/>
+          <w:color w:val="1A1A1A"/>
+          <w:sz w:val="20"/>
+          <w:szCs w:val="20"/>
+        </w:rPr>
+        <w:t xml:space="preserve">Raised on-time shipment rate from 91% to 98.5% across two Brightpine Distribution centers.</w:t>
       </w:r>
     </w:p>
     <w:p>

</xml_diff>